<commit_message>
Resume: FS-RISK CONSULTING FS-TPRM-Manager @ EY (MNC)
</commit_message>
<xml_diff>
--- a/resumes/Resume_FS-RISK_CONSULTING_FS-TPRM-Manager_EY__MNC_.docx
+++ b/resumes/Resume_FS-RISK_CONSULTING_FS-TPRM-Manager_EY__MNC_.docx
@@ -412,7 +412,7 @@
           <w:sz w:val="19"/>
           <w:szCs w:val="19"/>
         </w:rPr>
-        <w:t>Triaged 50+ weekly inventory reimbursement cases by severity and policy eligibility, mirroring the structured alert triage and escalation workflow used in risk management and compliance roles.</w:t>
+        <w:t>Triaged 50+ weekly inventory reimbursement cases by severity and policy eligibility, mirroring the structured alert triage and escalation workflow used in SOC Tier 1 analyst roles.</w:t>
       </w:r>
       <w:proofErr w:type="spellStart"/>
       <w:r>
@@ -449,7 +449,7 @@
           <w:sz w:val="19"/>
           <w:szCs w:val="19"/>
         </w:rPr>
-        <w:t>Performed root cause analysis on seller claims to identify policy violations and anomalous patterns; escalated findings to senior reviewers, demonstrating investigative instincts central to risk management and consulting operations.</w:t>
+        <w:t>Performed root cause analysis on seller claims to identify policy violations and anomalous patterns; escalated findings to senior reviewers, demonstrating investigative instincts central to SOC and fraud analyst operations.</w:t>
       </w:r>
     </w:p>
     <w:p>
@@ -468,7 +468,7 @@
           <w:sz w:val="19"/>
           <w:szCs w:val="19"/>
         </w:rPr>
-        <w:t>Maintained audit-ready case documentation recording investigation findings, decisions, and corrective actions, establishing the evidence chain-of-custody discipline required for IT audit and regulatory compliance.</w:t>
+        <w:t>Maintained audit-ready case documentation recording investigation findings, decisions, and corrective actions, establishing the evidence chain-of-custody discipline required for security incident reporting and IT audit.</w:t>
       </w:r>
     </w:p>
     <w:p>
@@ -525,7 +525,7 @@
             <w:color w:val="000000"/>
             <w:u w:val="single"/>
           </w:rPr>
-          <w:t>SOC Automation and Threat Detection Lab</w:t>
+          <w:t>FS-RISK CONSULTING FS-TPRM-Manager</w:t>
         </w:r>
       </w:hyperlink>
       <w:r>
@@ -581,7 +581,7 @@
           <w:sz w:val="19"/>
           <w:szCs w:val="19"/>
         </w:rPr>
-        <w:t>Built automated SOAR (security orchestration and automation)-style detection pipeline: Python script ingests Splunk alerts, runs IOC enrichment (threat intelligence) via VirusTotal API, and dispatches Telegram notifications with severity classification — reducing mean time to triage by automating repetitive tasks.</w:t>
+        <w:t>Built automated SOAR (security orchestration and automation)-style detection pipeline: Python script ingests Splunk alerts, runs IOC enrichment (threat intelligence) via VirusTotal API, and dispatches Telegram notifications with severity classification — reducing mean time to triage by automating repetitive L1 tasks.</w:t>
       </w:r>
     </w:p>
     <w:p>
@@ -661,7 +661,7 @@
             <w:color w:val="000000"/>
             <w:u w:val="single"/>
           </w:rPr>
-          <w:t>Vulnerability Scanner and Patch Prioritization Engine</w:t>
+          <w:t>FS-RISK CONSULTING FS-TPRM-Manager</w:t>
         </w:r>
       </w:hyperlink>
       <w:r>
@@ -698,7 +698,7 @@
           <w:sz w:val="19"/>
           <w:szCs w:val="19"/>
         </w:rPr>
-        <w:t>Built automated vulnerability assessment pipeline integrating Nessus and OpenVAS REST APIs in Python; generates CVE reports classified by CVSS severity (vulnerability prioritisation); implemented EPSS scoring (exploit probability scoring) from FIRST.org API to prioritise by actual exploit probability.</w:t>
+        <w:t>Built automated vulnerability assessment pipeline integrating Nessus and OpenVAS REST APIs in Python; generates CVE reports classified by CVSS severity (vulnerability prioritisation); implemented EPSS scoring (exploit probability scoring) from FIRST.org API to prioritise by actual exploit probability — a metric rarely used by freshers.</w:t>
       </w:r>
     </w:p>
     <w:p>

</xml_diff>